<commit_message>
Redesign homepage goes live: share button, mtime latest, book grids with tints, book renames
</commit_message>
<xml_diff>
--- a/docs/downloads/منوعات/doc_0672.docx
+++ b/docs/downloads/منوعات/doc_0672.docx
@@ -4,549 +4,408 @@
   <w:body>
     <w:p>
       <w:pPr>
-        <w:rPr>
-          <w:rtl/>
-          <w:lang w:bidi="ar-AE"/>
+        <w:bidi/>
+        <w:jc w:val="both"/>
+        <w:rPr>
+          <w:rFonts w:ascii="Sakkal Majalla" w:hAnsi="Sakkal Majalla" w:cs="Sakkal Majalla"/>
+          <w:sz w:val="28"/>
+          <w:szCs w:val="28"/>
+          <w:rtl/>
         </w:rPr>
       </w:pPr>
       <w:hyperlink r:id="rId4" w:history="1">
         <w:r>
           <w:rPr>
             <w:rStyle w:val="Hyperlink"/>
-            <w:rFonts w:hint="cs"/>
+            <w:rFonts w:ascii="Sakkal Majalla" w:hAnsi="Sakkal Majalla" w:cs="Sakkal Majalla" w:hint="cs"/>
+            <w:sz w:val="28"/>
+            <w:szCs w:val="28"/>
             <w:rtl/>
-            <w:lang w:bidi="ar-AE"/>
           </w:rPr>
-          <w:t>أفكار حول إنجيل يوحنا</w:t>
+          <w:t>أخطأتُ!</w:t>
         </w:r>
       </w:hyperlink>
     </w:p>
     <w:p>
       <w:pPr>
-        <w:rPr>
-          <w:rtl/>
-          <w:lang w:bidi="ar-AE"/>
-        </w:rPr>
-      </w:pPr>
-      <w:r>
-        <w:rPr>
-          <w:lang w:bidi="ar-AE"/>
-        </w:rPr>
-        <w:t>August van Ryn</w:t>
+        <w:bidi/>
+        <w:jc w:val="both"/>
+        <w:rPr>
+          <w:rFonts w:ascii="Sakkal Majalla" w:hAnsi="Sakkal Majalla" w:cs="Sakkal Majalla"/>
+          <w:sz w:val="28"/>
+          <w:szCs w:val="28"/>
+          <w:rtl/>
+        </w:rPr>
+      </w:pPr>
+      <w:r>
+        <w:rPr>
+          <w:rFonts w:ascii="Sakkal Majalla" w:hAnsi="Sakkal Majalla" w:cs="Sakkal Majalla" w:hint="cs"/>
+          <w:sz w:val="28"/>
+          <w:szCs w:val="28"/>
+          <w:rtl/>
+        </w:rPr>
+        <w:t xml:space="preserve">خروج 9: 27 </w:t>
+      </w:r>
+      <w:r>
+        <w:rPr>
+          <w:rFonts w:ascii="Sakkal Majalla" w:hAnsi="Sakkal Majalla" w:cs="Sakkal Majalla"/>
+          <w:sz w:val="28"/>
+          <w:szCs w:val="28"/>
+          <w:rtl/>
+        </w:rPr>
+        <w:t>–</w:t>
+      </w:r>
+      <w:r>
+        <w:rPr>
+          <w:rFonts w:ascii="Sakkal Majalla" w:hAnsi="Sakkal Majalla" w:cs="Sakkal Majalla" w:hint="cs"/>
+          <w:sz w:val="28"/>
+          <w:szCs w:val="28"/>
+          <w:rtl/>
+        </w:rPr>
+        <w:t xml:space="preserve"> 28، سفر العدد 22: 34؛ يشوع 7: 20؛ 1. صموئيل 15: 24، 30؛ 2. صموئيل 12: 13؛ متى 27: 4؛ لوقا 15: 21</w:t>
       </w:r>
     </w:p>
     <w:p>
       <w:pPr>
-        <w:rPr>
-          <w:rtl/>
-          <w:lang w:bidi="ar-AE"/>
-        </w:rPr>
-      </w:pPr>
-      <w:r>
-        <w:rPr>
-          <w:rFonts w:hint="cs"/>
-          <w:rtl/>
-          <w:lang w:bidi="ar-AE"/>
-        </w:rPr>
-        <w:t>مقدمة الإصدار بالإنجليزية</w:t>
+        <w:bidi/>
+        <w:jc w:val="both"/>
+        <w:rPr>
+          <w:rFonts w:ascii="Sakkal Majalla" w:hAnsi="Sakkal Majalla" w:cs="Sakkal Majalla"/>
+          <w:sz w:val="28"/>
+          <w:szCs w:val="28"/>
+          <w:rtl/>
+        </w:rPr>
+      </w:pPr>
+      <w:r>
+        <w:rPr>
+          <w:rFonts w:ascii="Sakkal Majalla" w:hAnsi="Sakkal Majalla" w:cs="Sakkal Majalla" w:hint="cs"/>
+          <w:sz w:val="28"/>
+          <w:szCs w:val="28"/>
+          <w:rtl/>
+        </w:rPr>
+        <w:t>"</w:t>
+      </w:r>
+      <w:r>
+        <w:rPr>
+          <w:rFonts w:ascii="Sakkal Majalla" w:hAnsi="Sakkal Majalla" w:cs="Sakkal Majalla"/>
+          <w:sz w:val="28"/>
+          <w:szCs w:val="28"/>
+          <w:rtl/>
+        </w:rPr>
+        <w:t>أَخْطَأْتُ</w:t>
+      </w:r>
+      <w:r>
+        <w:rPr>
+          <w:rFonts w:ascii="Sakkal Majalla" w:hAnsi="Sakkal Majalla" w:cs="Sakkal Majalla" w:hint="cs"/>
+          <w:sz w:val="28"/>
+          <w:szCs w:val="28"/>
+          <w:rtl/>
+        </w:rPr>
+        <w:t xml:space="preserve">" هي كاللغة الصينية </w:t>
+      </w:r>
+      <w:r>
+        <w:rPr>
+          <w:rFonts w:ascii="Sakkal Majalla" w:hAnsi="Sakkal Majalla" w:cs="Sakkal Majalla"/>
+          <w:sz w:val="28"/>
+          <w:szCs w:val="28"/>
+          <w:rtl/>
+        </w:rPr>
+        <w:t>–</w:t>
+      </w:r>
+      <w:r>
+        <w:rPr>
+          <w:rFonts w:ascii="Sakkal Majalla" w:hAnsi="Sakkal Majalla" w:cs="Sakkal Majalla" w:hint="cs"/>
+          <w:sz w:val="28"/>
+          <w:szCs w:val="28"/>
+          <w:rtl/>
+        </w:rPr>
+        <w:t xml:space="preserve"> هكذا من الصعب ان تظهر هذه الكلمة على شفاهنا. فمتى ما نطقنا بها يبقى السؤال: كم كنا صادقين في ذلك؟ الكتاب المقدس يقدّم لنا سبع أشخاص نسمع كل منهم يقول "</w:t>
+      </w:r>
+      <w:r>
+        <w:rPr>
+          <w:rFonts w:ascii="Sakkal Majalla" w:hAnsi="Sakkal Majalla" w:cs="Sakkal Majalla"/>
+          <w:sz w:val="28"/>
+          <w:szCs w:val="28"/>
+          <w:rtl/>
+        </w:rPr>
+        <w:t>أَخْطَأْتُ</w:t>
+      </w:r>
+      <w:r>
+        <w:rPr>
+          <w:rFonts w:ascii="Sakkal Majalla" w:hAnsi="Sakkal Majalla" w:cs="Sakkal Majalla" w:hint="cs"/>
+          <w:sz w:val="28"/>
+          <w:szCs w:val="28"/>
+          <w:rtl/>
+        </w:rPr>
+        <w:t>". دعونا ننظر إلى هذه الاعترافات بأكثر دقة. ...</w:t>
       </w:r>
     </w:p>
     <w:p>
       <w:pPr>
-        <w:rPr>
-          <w:rtl/>
-          <w:lang w:bidi="ar-AE"/>
-        </w:rPr>
-        <w:sectPr>
-          <w:pgSz w:w="11906" w:h="16838"/>
-          <w:pgMar w:top="1440" w:right="1800" w:bottom="1440" w:left="1800" w:header="708" w:footer="708" w:gutter="0"/>
-          <w:cols w:space="708"/>
-          <w:bidi/>
-          <w:rtlGutter/>
-          <w:docGrid w:linePitch="360"/>
-        </w:sectPr>
-      </w:pPr>
-      <w:r>
-        <w:rPr>
-          <w:rFonts w:hint="cs"/>
-          <w:rtl/>
-          <w:lang w:bidi="ar-AE"/>
-        </w:rPr>
-        <w:t>إن صلاة كاتب هذا الكتاب هي بأن تستأسر بعض جمالات وأمجاد هذا الإنجيل اهتمام القارئ</w:t>
-      </w:r>
-      <w:r>
-        <w:rPr>
-          <w:rFonts w:hint="cs"/>
-          <w:rtl/>
-          <w:lang w:bidi="ar-AE"/>
-        </w:rPr>
-        <w:t xml:space="preserve">. هذا التأمل ليس هو شرح في حد مفهومه كما وبالتالي لا يستهدف أيضًا بأن يكون تفسيرًا وافيًا لهذا الخبر الرائع عن شخص المسيح وعمله. إلا أني بالمقابل أود بأن أدوّن ببساطة بعض الأفكار التي أصبحت قيمة جدًا لي وأجعلها متاحة للقراء. إن الإنجيل بحسب يوحنا </w:t>
-      </w:r>
-      <w:r>
-        <w:rPr>
-          <w:rtl/>
-          <w:lang w:bidi="ar-AE"/>
-        </w:rPr>
-        <w:t>–</w:t>
-      </w:r>
-      <w:r>
-        <w:rPr>
-          <w:rFonts w:hint="cs"/>
-          <w:rtl/>
-          <w:lang w:bidi="ar-AE"/>
-        </w:rPr>
-        <w:t xml:space="preserve"> كما كل الكتاب </w:t>
-      </w:r>
-      <w:r>
-        <w:rPr>
-          <w:rtl/>
-          <w:lang w:bidi="ar-AE"/>
-        </w:rPr>
-        <w:t>–</w:t>
-      </w:r>
-      <w:r>
-        <w:rPr>
-          <w:rFonts w:hint="cs"/>
-          <w:rtl/>
-          <w:lang w:bidi="ar-AE"/>
-        </w:rPr>
-        <w:t xml:space="preserve"> واسع جدًا وعميق وسامي حتى أننا نرى ضعفنا وعجزنا في تقديم هذه الجمالات. لأجل هذا أنا أوصي بهذا العمل لله ليباركه. وأنصح به للقارئ المتأمل بإسهاب. إني سأمجّد الرب عندما يتمجد المسيح وتتبارك نفوسنا.</w:t>
+        <w:bidi/>
+        <w:jc w:val="both"/>
+        <w:rPr>
+          <w:rFonts w:ascii="Sakkal Majalla" w:hAnsi="Sakkal Majalla" w:cs="Sakkal Majalla"/>
+          <w:sz w:val="28"/>
+          <w:szCs w:val="28"/>
+          <w:rtl/>
+        </w:rPr>
+      </w:pPr>
+      <w:r>
+        <w:rPr>
+          <w:rFonts w:ascii="Sakkal Majalla" w:hAnsi="Sakkal Majalla" w:cs="Sakkal Majalla" w:hint="cs"/>
+          <w:sz w:val="28"/>
+          <w:szCs w:val="28"/>
+          <w:rtl/>
+        </w:rPr>
+        <w:t>الأول من بين السبعة الذين نسمع منهم الكلمة: "أخطأت" هو ليس إلا الحاكم المصري، الذي لم يكن يريد أن يُطلق شعب إسرائيل.</w:t>
       </w:r>
     </w:p>
     <w:p>
       <w:pPr>
-        <w:rPr>
-          <w:rtl/>
-          <w:lang w:bidi="ar-AE"/>
-        </w:rPr>
-      </w:pPr>
-      <w:r>
-        <w:rPr>
-          <w:rFonts w:hint="cs"/>
-          <w:rtl/>
-          <w:lang w:bidi="ar-AE"/>
-        </w:rPr>
-        <w:t>تمهيد</w:t>
+        <w:bidi/>
+        <w:jc w:val="both"/>
+        <w:rPr>
+          <w:rFonts w:ascii="Sakkal Majalla" w:hAnsi="Sakkal Majalla" w:cs="Sakkal Majalla"/>
+          <w:sz w:val="28"/>
+          <w:szCs w:val="28"/>
+          <w:rtl/>
+        </w:rPr>
+      </w:pPr>
+      <w:r>
+        <w:rPr>
+          <w:rFonts w:ascii="Sakkal Majalla" w:hAnsi="Sakkal Majalla" w:cs="Sakkal Majalla" w:hint="cs"/>
+          <w:sz w:val="28"/>
+          <w:szCs w:val="28"/>
+          <w:rtl/>
+        </w:rPr>
+        <w:t>فرعون</w:t>
       </w:r>
     </w:p>
     <w:p>
       <w:pPr>
-        <w:rPr>
-          <w:rtl/>
-          <w:lang w:bidi="ar-AE"/>
-        </w:rPr>
-      </w:pPr>
-      <w:r>
-        <w:rPr>
-          <w:rFonts w:hint="cs"/>
-          <w:rtl/>
-          <w:lang w:bidi="ar-AE"/>
-        </w:rPr>
-        <w:t>"</w:t>
-      </w:r>
-      <w:r>
-        <w:rPr>
-          <w:rtl/>
-          <w:lang w:bidi="ar-AE"/>
-        </w:rPr>
-        <w:t xml:space="preserve"> وَأَشْيَاءُ أُخَرُ كَثِيرَةٌ صَنَعَهَا يَسُوعُ، إِنْ كُتِبَتْ وَاحِدَةً وَاحِدَةً، فَلَسْتُ أَظُنُّ أَنَّ الْعَالَمَ نَفْسَهُ يَسَعُ الْكُتُبَ الْمَكْتُوبَةَ. آمِينَ.</w:t>
-      </w:r>
-      <w:r>
-        <w:rPr>
-          <w:rFonts w:hint="cs"/>
-          <w:rtl/>
-          <w:lang w:bidi="ar-AE"/>
-        </w:rPr>
-        <w:t>" (يوحنا 21: 25).</w:t>
+        <w:bidi/>
+        <w:jc w:val="both"/>
+        <w:rPr>
+          <w:rFonts w:ascii="Sakkal Majalla" w:hAnsi="Sakkal Majalla" w:cs="Sakkal Majalla"/>
+          <w:sz w:val="28"/>
+          <w:szCs w:val="28"/>
+          <w:rtl/>
+        </w:rPr>
+      </w:pPr>
+      <w:r>
+        <w:rPr>
+          <w:rFonts w:ascii="Sakkal Majalla" w:hAnsi="Sakkal Majalla" w:cs="Sakkal Majalla" w:hint="cs"/>
+          <w:sz w:val="28"/>
+          <w:szCs w:val="28"/>
+          <w:rtl/>
+        </w:rPr>
+        <w:t xml:space="preserve">سبع ضربات كانت قد أوقعت على مصر. الضربة السابعة أنزلت بردًا </w:t>
+      </w:r>
+      <w:r>
+        <w:rPr>
+          <w:rFonts w:ascii="Sakkal Majalla" w:hAnsi="Sakkal Majalla" w:cs="Sakkal Majalla" w:hint="cs"/>
+          <w:sz w:val="28"/>
+          <w:szCs w:val="28"/>
+          <w:rtl/>
+        </w:rPr>
+        <w:t>مدمرًا</w:t>
+      </w:r>
+      <w:r>
+        <w:rPr>
+          <w:rFonts w:ascii="Sakkal Majalla" w:hAnsi="Sakkal Majalla" w:cs="Sakkal Majalla" w:hint="cs"/>
+          <w:sz w:val="28"/>
+          <w:szCs w:val="28"/>
+          <w:rtl/>
+        </w:rPr>
+        <w:t xml:space="preserve"> حتى أن</w:t>
+      </w:r>
+      <w:bookmarkStart w:id="0" w:name="_GoBack"/>
+      <w:bookmarkEnd w:id="0"/>
+      <w:r>
+        <w:rPr>
+          <w:rFonts w:ascii="Sakkal Majalla" w:hAnsi="Sakkal Majalla" w:cs="Sakkal Majalla" w:hint="cs"/>
+          <w:sz w:val="28"/>
+          <w:szCs w:val="28"/>
+          <w:rtl/>
+        </w:rPr>
+        <w:t xml:space="preserve"> الأشجار كسرها. عندها استدعى فرعون موسى وهارون وقال لهما: "</w:t>
+      </w:r>
+      <w:r>
+        <w:rPr>
+          <w:rFonts w:ascii="Sakkal Majalla" w:hAnsi="Sakkal Majalla" w:cs="Sakkal Majalla"/>
+          <w:sz w:val="28"/>
+          <w:szCs w:val="28"/>
+          <w:rtl/>
+        </w:rPr>
+        <w:t>«أَخْطَأْتُ هذِهِ الْمَرَّةَ. الرَّبُّ هُوَ الْبَارُّ وَأَنَا وَشَعْبِي الأَشْرَارُ.  28 صَلِّيَا إِلَى الرَّبِّ، وَكَفَى حُدُوثُ رُعُودِ اللهِ وَالْبَرَدُ، فَأُطْلِقَكُمْ وَلاَ تَعُودُوا تَلْبَثُونَ».</w:t>
+      </w:r>
+      <w:r>
+        <w:rPr>
+          <w:rFonts w:ascii="Sakkal Majalla" w:hAnsi="Sakkal Majalla" w:cs="Sakkal Majalla" w:hint="cs"/>
+          <w:sz w:val="28"/>
+          <w:szCs w:val="28"/>
+          <w:rtl/>
+        </w:rPr>
+        <w:t>" (خروج 9: 27، 28).</w:t>
       </w:r>
     </w:p>
     <w:p>
       <w:pPr>
-        <w:rPr>
-          <w:rtl/>
-          <w:lang w:bidi="ar-AE"/>
-        </w:rPr>
-      </w:pPr>
-      <w:r>
-        <w:rPr>
-          <w:rFonts w:hint="cs"/>
-          <w:rtl/>
-          <w:lang w:bidi="ar-AE"/>
-        </w:rPr>
-        <w:t>حتى وإن كانت الآلاف من الكتب والشروحات عن الكتاب المقدس موجودة، إلا أن هذا العدد يشجعني على الافتراض بأنه على الرغم من ذلك لا يزال هناك مجال لكتب مشغولة بكلام وأعمال الرب يسوع.</w:t>
+        <w:bidi/>
+        <w:jc w:val="both"/>
+        <w:rPr>
+          <w:rFonts w:ascii="Sakkal Majalla" w:hAnsi="Sakkal Majalla" w:cs="Sakkal Majalla"/>
+          <w:sz w:val="28"/>
+          <w:szCs w:val="28"/>
+          <w:rtl/>
+        </w:rPr>
+      </w:pPr>
+      <w:r>
+        <w:rPr>
+          <w:rFonts w:ascii="Sakkal Majalla" w:hAnsi="Sakkal Majalla" w:cs="Sakkal Majalla" w:hint="cs"/>
+          <w:sz w:val="28"/>
+          <w:szCs w:val="28"/>
+          <w:rtl/>
+        </w:rPr>
+        <w:t>ما هو موقفنا من هذا الاعتراف؟ للأسف ليس الكثير. إنه يظهر نقائض على نحو واسع:</w:t>
       </w:r>
     </w:p>
     <w:p>
       <w:pPr>
-        <w:rPr>
-          <w:rtl/>
-          <w:lang w:bidi="ar-AE"/>
-        </w:rPr>
-      </w:pPr>
-      <w:r>
-        <w:rPr>
-          <w:rFonts w:hint="cs"/>
-          <w:rtl/>
-          <w:lang w:bidi="ar-AE"/>
-        </w:rPr>
-        <w:t>الكثير من الأفكار المكتوبة في هذا الكتاب قد جُمّعت على مدار سنوات من العمل من كلام قاله وكتبه آخرون؛ والبعض منها أظهرها الله للكاتب من خلال دراسته المباشرة لكلمة الله.</w:t>
+        <w:bidi/>
+        <w:jc w:val="both"/>
+        <w:rPr>
+          <w:rFonts w:ascii="Sakkal Majalla" w:hAnsi="Sakkal Majalla" w:cs="Sakkal Majalla"/>
+          <w:sz w:val="28"/>
+          <w:szCs w:val="28"/>
+          <w:rtl/>
+        </w:rPr>
+      </w:pPr>
+      <w:r>
+        <w:rPr>
+          <w:rFonts w:ascii="Sakkal Majalla" w:hAnsi="Sakkal Majalla" w:cs="Sakkal Majalla" w:hint="cs"/>
+          <w:sz w:val="28"/>
+          <w:szCs w:val="28"/>
+          <w:rtl/>
+        </w:rPr>
+        <w:t>* لقد تكلم فرعون بأنه هذه المرة أخطأ. إن هذا كان أقل من كل توقع لأنه كان قد أظهر مراتٍ عديدة موقفًا ضد أمر الله. فالاعتراف بالنفس وبالخطايا له صورة مختلفة تمامًا عن ذلك.</w:t>
       </w:r>
     </w:p>
     <w:p>
       <w:pPr>
-        <w:rPr>
-          <w:rtl/>
-          <w:lang w:bidi="ar-AE"/>
-        </w:rPr>
-      </w:pPr>
-      <w:r>
-        <w:rPr>
-          <w:rFonts w:hint="cs"/>
-          <w:rtl/>
-          <w:lang w:bidi="ar-AE"/>
-        </w:rPr>
-        <w:t>نحن علينا دائمًا أن نعود إلى كلمة الله مع صلاة صاحب المزمور:</w:t>
+        <w:bidi/>
+        <w:jc w:val="both"/>
+        <w:rPr>
+          <w:rFonts w:ascii="Sakkal Majalla" w:hAnsi="Sakkal Majalla" w:cs="Sakkal Majalla"/>
+          <w:sz w:val="28"/>
+          <w:szCs w:val="28"/>
+          <w:rtl/>
+        </w:rPr>
+      </w:pPr>
+      <w:r>
+        <w:rPr>
+          <w:rFonts w:ascii="Sakkal Majalla" w:hAnsi="Sakkal Majalla" w:cs="Sakkal Majalla" w:hint="cs"/>
+          <w:sz w:val="28"/>
+          <w:szCs w:val="28"/>
+          <w:rtl/>
+        </w:rPr>
+        <w:t>* لقد جرّ فرعون شعبه وراءه. هذا لم يكن عادلاً. لأنه ماذا كانت مسؤولية الذين عملوا في الطين على سبيل المثال في هذا الأمر؟</w:t>
       </w:r>
     </w:p>
     <w:p>
       <w:pPr>
-        <w:rPr>
-          <w:rtl/>
-          <w:lang w:bidi="ar-AE"/>
-        </w:rPr>
-      </w:pPr>
-      <w:r>
-        <w:rPr>
-          <w:rFonts w:hint="cs"/>
-          <w:rtl/>
-          <w:lang w:bidi="ar-AE"/>
-        </w:rPr>
-        <w:t>"</w:t>
-      </w:r>
-      <w:r>
-        <w:rPr>
-          <w:rtl/>
-          <w:lang w:bidi="ar-AE"/>
-        </w:rPr>
-        <w:t>اكْشِفْ عَنْ عَيْنَيَّ فَأَرَى عَجَائِبَ مِنْ شَرِيعَتِكَ.</w:t>
-      </w:r>
-      <w:r>
-        <w:rPr>
-          <w:rFonts w:hint="cs"/>
-          <w:rtl/>
-          <w:lang w:bidi="ar-AE"/>
-        </w:rPr>
-        <w:t>" (119: 18).</w:t>
+        <w:bidi/>
+        <w:jc w:val="both"/>
+        <w:rPr>
+          <w:rFonts w:ascii="Sakkal Majalla" w:hAnsi="Sakkal Majalla" w:cs="Sakkal Majalla"/>
+          <w:sz w:val="28"/>
+          <w:szCs w:val="28"/>
+          <w:rtl/>
+        </w:rPr>
+      </w:pPr>
+      <w:r>
+        <w:rPr>
+          <w:rFonts w:ascii="Sakkal Majalla" w:hAnsi="Sakkal Majalla" w:cs="Sakkal Majalla" w:hint="cs"/>
+          <w:sz w:val="28"/>
+          <w:szCs w:val="28"/>
+          <w:rtl/>
+        </w:rPr>
+        <w:t>* لقد فكّر فرعون بعواقب عدم طاعته المتصلبة أكثر من عدم طاعته. لقد أراد أن يتحرر بسرعة أولاً من الرعود والبرد (خروج 9: 28).</w:t>
       </w:r>
     </w:p>
     <w:p>
       <w:pPr>
-        <w:rPr>
-          <w:rtl/>
-          <w:lang w:bidi="ar-AE"/>
-        </w:rPr>
-        <w:sectPr>
-          <w:pgSz w:w="11906" w:h="16838"/>
-          <w:pgMar w:top="1440" w:right="1800" w:bottom="1440" w:left="1800" w:header="708" w:footer="708" w:gutter="0"/>
-          <w:cols w:space="708"/>
-          <w:bidi/>
-          <w:rtlGutter/>
-          <w:docGrid w:linePitch="360"/>
-        </w:sectPr>
-      </w:pPr>
-      <w:r>
-        <w:rPr>
-          <w:rFonts w:hint="cs"/>
-          <w:rtl/>
-          <w:lang w:bidi="ar-AE"/>
-        </w:rPr>
-        <w:t>صلاتي هي بأن يستخدم الرب بعض الأفكار المطروحة لفائدة وفرح القارئ كما أن القدوم والانشغال به أدخل فيّ فرحًا عظيمًا. في بداية هذا الكتاب ربما يجوز لي أن أستخدم الكلمات من يوحنا 20: 31 وأقول، بأنه من الممكن أن يكون هنالك الكثير من الكتب الأخرى عن إنجيل يوحنا، والتي فيها أفكار لم تحظى هنا على لفت الإنتباه إليها. لكن هذا الكتاب كُتب</w:t>
-      </w:r>
-      <w:r>
-        <w:rPr>
-          <w:rFonts w:hint="cs"/>
-          <w:rtl/>
-          <w:lang w:bidi="ar-AE"/>
-        </w:rPr>
-        <w:t xml:space="preserve"> ليعرف القارئ بأن يسوع هو ابن الله وبأننا يجب أن ننقاد إلى الإيمان باسمه لنحصل على الحياة فيه.</w:t>
+        <w:bidi/>
+        <w:jc w:val="both"/>
+        <w:rPr>
+          <w:rFonts w:ascii="Sakkal Majalla" w:hAnsi="Sakkal Majalla" w:cs="Sakkal Majalla"/>
+          <w:sz w:val="28"/>
+          <w:szCs w:val="28"/>
+          <w:rtl/>
+        </w:rPr>
+      </w:pPr>
+      <w:r>
+        <w:rPr>
+          <w:rFonts w:ascii="Sakkal Majalla" w:hAnsi="Sakkal Majalla" w:cs="Sakkal Majalla" w:hint="cs"/>
+          <w:sz w:val="28"/>
+          <w:szCs w:val="28"/>
+          <w:rtl/>
+        </w:rPr>
+        <w:t xml:space="preserve">عند الضربة الثامنة حينما التهم الجراد كل أخضر </w:t>
+      </w:r>
+      <w:r>
+        <w:rPr>
+          <w:rFonts w:ascii="Sakkal Majalla" w:hAnsi="Sakkal Majalla" w:cs="Sakkal Majalla"/>
+          <w:sz w:val="28"/>
+          <w:szCs w:val="28"/>
+          <w:rtl/>
+        </w:rPr>
+        <w:t>–</w:t>
+      </w:r>
+      <w:r>
+        <w:rPr>
+          <w:rFonts w:ascii="Sakkal Majalla" w:hAnsi="Sakkal Majalla" w:cs="Sakkal Majalla" w:hint="cs"/>
+          <w:sz w:val="28"/>
+          <w:szCs w:val="28"/>
+          <w:rtl/>
+        </w:rPr>
+        <w:t xml:space="preserve"> نجد من جديد اعترافًا: "</w:t>
       </w:r>
     </w:p>
     <w:p>
       <w:pPr>
-        <w:rPr>
-          <w:rtl/>
-          <w:lang w:bidi="ar-AE"/>
-        </w:rPr>
-      </w:pPr>
-      <w:hyperlink r:id="rId5" w:history="1">
-        <w:r>
-          <w:rPr>
-            <w:rStyle w:val="Hyperlink"/>
-            <w:rFonts w:hint="cs"/>
-            <w:rtl/>
-            <w:lang w:bidi="ar-AE"/>
-          </w:rPr>
-          <w:t>محتوى الإنجيل</w:t>
-        </w:r>
-      </w:hyperlink>
-    </w:p>
-    <w:p>
-      <w:pPr>
-        <w:rPr>
-          <w:rtl/>
-          <w:lang w:bidi="ar-AE"/>
-        </w:rPr>
-      </w:pPr>
-      <w:r>
-        <w:rPr>
-          <w:rFonts w:hint="cs"/>
-          <w:rtl/>
-          <w:lang w:bidi="ar-AE"/>
-        </w:rPr>
-        <w:t>"</w:t>
-      </w:r>
-      <w:r>
-        <w:rPr>
-          <w:rtl/>
-          <w:lang w:bidi="ar-AE"/>
-        </w:rPr>
-        <w:t>وَآيَاتٍ أُخَرَ كَثِيرَةً صَنَعَ يَسُوعُ قُدَّامَ تَلاَمِيذِهِ لَمْ تُكْتَبْ فِي هذَا الْكِتَابِ. وَأَمَّا هذِهِ فَقَدْ كُتِبَتْ لِتُؤْمِنُوا أَنَّ يَسُوعَ هُوَ الْمَسِيحُ ابْنُ اللهِ، وَلِكَيْ تَكُونَ لَكُمْ إِذَا آمَنْتُمْ حَيَاةٌ بِاسْمِهِ.</w:t>
-      </w:r>
-      <w:r>
-        <w:rPr>
-          <w:rFonts w:hint="cs"/>
-          <w:rtl/>
-          <w:lang w:bidi="ar-AE"/>
-        </w:rPr>
-        <w:t>" (يوحنا 20: 30، 31).</w:t>
-      </w:r>
-    </w:p>
-    <w:p>
-      <w:pPr>
-        <w:rPr>
-          <w:rtl/>
-          <w:lang w:bidi="ar-AE"/>
-        </w:rPr>
-      </w:pPr>
-      <w:r>
-        <w:rPr>
-          <w:rFonts w:hint="cs"/>
-          <w:rtl/>
-          <w:lang w:bidi="ar-AE"/>
-        </w:rPr>
-        <w:t>لقد سُرّ روح الله بأن يخبرنا بواسطة يوحنا ما هو غاية هذا الإنجيل. على الإنسان أن يكون على عِلم بذلك في الإيمان، مَن هو يسوع. ليس فقط أننا نعرفه</w:t>
-      </w:r>
-      <w:r>
-        <w:rPr>
-          <w:rFonts w:hint="cs"/>
-          <w:rtl/>
-          <w:lang w:bidi="ar-AE"/>
-        </w:rPr>
-        <w:t xml:space="preserve"> أو نعلم مَن يكون. علينا أن نكون على عِلم عميق بأن يسوع هو المسيح وابن الله. لأجل ذلك يخبر يوحنا عن عجائب لم تذكرها الأناجيل الثلاثة الأخرى. أنا أعتقد بأنها فقط خمس عجائب المذكورة في إنجيل يوحنا فقط. جميعها تُلفت انتباهنا بشكل خاص إلى شخص المسيح، إلى كلية قدرته، كلية عِلمه، ومحبته. يوحنا يذكر عداها 9 أو 10 أحداث أخرى هي ليست عجائب في حصر مفهومها، غير أنها </w:t>
-      </w:r>
-      <w:r>
-        <w:rPr>
-          <w:rFonts w:hint="cs"/>
-          <w:rtl/>
-          <w:lang w:bidi="ar-AE"/>
-        </w:rPr>
-        <w:t>تسلّط الضوء على سمات ابن الله الرائعة. من بينها الحديث مع نثنائيل، طرد الباعة من الهيكل، تصرفه مع المرأة في يوحنا 8</w:t>
-      </w:r>
-      <w:r>
-        <w:rPr>
-          <w:rFonts w:hint="cs"/>
-          <w:rtl/>
-          <w:lang w:bidi="ar-AE"/>
-        </w:rPr>
-        <w:t xml:space="preserve"> وأيضًا غسل الأرجل في يوحنا 13.</w:t>
-      </w:r>
-    </w:p>
-    <w:p>
-      <w:pPr>
-        <w:rPr>
-          <w:rtl/>
-          <w:lang w:bidi="ar-AE"/>
-        </w:rPr>
-      </w:pPr>
-      <w:r>
-        <w:rPr>
-          <w:rFonts w:hint="cs"/>
-          <w:rtl/>
-          <w:lang w:bidi="ar-AE"/>
-        </w:rPr>
-        <w:t>إنجيل يوحنا يرينا الكلمة الأبدية التي صارت إنسانًا. هذا يذكرنا بالكائن الحي الرابع في رؤيا 4: 7، الذي له جناحي نسر. هذا النسر يمثّل الرب يسوع كالسماوي. بقية الحيوانات المذكورة هناك هي أرضية. لكن موطن النسر هو في العلاء. كذلك في دانيال 3: 25 كانت هيئة الرابع هيئة ابن الله. الرب بنفسه دخل وسط خاصته في أل</w:t>
-      </w:r>
-      <w:r>
-        <w:rPr>
-          <w:rFonts w:hint="cs"/>
-          <w:rtl/>
-          <w:lang w:bidi="ar-AE"/>
-        </w:rPr>
-        <w:t>ا</w:t>
-      </w:r>
-      <w:r>
-        <w:rPr>
-          <w:rFonts w:hint="cs"/>
-          <w:rtl/>
-          <w:lang w:bidi="ar-AE"/>
-        </w:rPr>
-        <w:t xml:space="preserve">مات النار. </w:t>
-      </w:r>
-      <w:r>
-        <w:rPr>
-          <w:rFonts w:hint="cs"/>
-          <w:rtl/>
-          <w:lang w:bidi="ar-AE"/>
-        </w:rPr>
-        <w:t>في قصة الخليقة نعلم بأن الله وضع الشمس لحُكم الأرض في اليوم الرابع لتنير الأرض (تكوين 1: 17). الشمس التي وُضعت في الأفق لتبسط بنورها على الأرض هي مثال للشمس المشرقة في إنجيل يوحنا لتبسط نورها في هذا العالم المظلم ولتظلله.</w:t>
-      </w:r>
-    </w:p>
-    <w:p>
-      <w:pPr>
-        <w:rPr>
-          <w:rtl/>
-          <w:lang w:bidi="ar-AE"/>
-        </w:rPr>
-      </w:pPr>
-      <w:r>
-        <w:rPr>
-          <w:rFonts w:hint="cs"/>
-          <w:rtl/>
-          <w:lang w:bidi="ar-AE"/>
-        </w:rPr>
-        <w:t xml:space="preserve">الأناجيل السينوبتيكية (متى، مرقس ولوقا) مهدّت الطريق لتقديم الرب يسوع في كل جماله الأدبي بواسطة يوحنا. الأناجيل الأخرى تسلمنا سيرة المسيح. يوحنا يمكث في سر شخصه البديع. إنجيل يوحنا له طابع كوني كالشمس لا يتطرق لكل بركة بمفردها، وإنما يخرج إلى كل العالم. شمس الله تضيء على الجميع وكل نفس يحق لها أن تستدفئ باشعتها الدافئة. الشمس لها ثلاث صفات رئيسية: هي تعطي حياة، نور ودفء. ذات الصفات نجدها مركزة في شخص ابن الله. بالإشارة إليه </w:t>
-      </w:r>
-      <w:r>
-        <w:rPr>
-          <w:rFonts w:hint="cs"/>
-          <w:rtl/>
-          <w:lang w:bidi="ar-AE"/>
-        </w:rPr>
-        <w:t>هذه الصفات هي: حياة، نور ومحبة. هذه الصفات نجدها ايضًا في الثلاث أجزاء من إنجيل يوحنا:</w:t>
-      </w:r>
-    </w:p>
-    <w:p>
-      <w:pPr>
-        <w:spacing w:after="0"/>
-        <w:rPr>
-          <w:rtl/>
-          <w:lang w:bidi="ar-AE"/>
-        </w:rPr>
-      </w:pPr>
-      <w:r>
-        <w:rPr>
-          <w:rFonts w:hint="cs"/>
-          <w:rtl/>
-          <w:lang w:bidi="ar-AE"/>
-        </w:rPr>
-        <w:t xml:space="preserve">1. حياة: يوحنا 1 </w:t>
-      </w:r>
-      <w:r>
-        <w:rPr>
-          <w:rtl/>
-          <w:lang w:bidi="ar-AE"/>
-        </w:rPr>
-        <w:t>–</w:t>
-      </w:r>
-      <w:r>
-        <w:rPr>
-          <w:rFonts w:hint="cs"/>
-          <w:rtl/>
-          <w:lang w:bidi="ar-AE"/>
-        </w:rPr>
-        <w:t xml:space="preserve"> 7</w:t>
-      </w:r>
-    </w:p>
-    <w:p>
-      <w:pPr>
-        <w:spacing w:after="0"/>
-        <w:rPr>
-          <w:rtl/>
-          <w:lang w:bidi="ar-AE"/>
-        </w:rPr>
-      </w:pPr>
-      <w:r>
-        <w:rPr>
-          <w:rFonts w:hint="cs"/>
-          <w:rtl/>
-          <w:lang w:bidi="ar-AE"/>
-        </w:rPr>
-        <w:t>2. نور: يوحنا 8: 12</w:t>
-      </w:r>
-    </w:p>
-    <w:p>
-      <w:pPr>
-        <w:rPr>
-          <w:rtl/>
-          <w:lang w:bidi="ar-AE"/>
-        </w:rPr>
-      </w:pPr>
-      <w:r>
-        <w:rPr>
-          <w:rFonts w:hint="cs"/>
-          <w:rtl/>
-          <w:lang w:bidi="ar-AE"/>
-        </w:rPr>
-        <w:t xml:space="preserve">3. محبة: يوحنا 13 </w:t>
-      </w:r>
-      <w:r>
-        <w:rPr>
-          <w:rtl/>
-          <w:lang w:bidi="ar-AE"/>
-        </w:rPr>
-        <w:t>–</w:t>
-      </w:r>
-      <w:r>
-        <w:rPr>
-          <w:rFonts w:hint="cs"/>
-          <w:rtl/>
-          <w:lang w:bidi="ar-AE"/>
-        </w:rPr>
-        <w:t xml:space="preserve"> 17.</w:t>
-      </w:r>
-    </w:p>
-    <w:p>
-      <w:pPr>
-        <w:rPr>
-          <w:lang w:bidi="ar-AE"/>
-        </w:rPr>
-      </w:pPr>
-      <w:r>
-        <w:rPr>
-          <w:rFonts w:hint="cs"/>
-          <w:rtl/>
-          <w:lang w:bidi="ar-AE"/>
-        </w:rPr>
-        <w:t xml:space="preserve">صفات رائعة تجد إشراقها في كمالها في المسيح وهي تسد احتياجات الإنسان الحقيقية الموجود في حالة روحية ميتة في ظلام </w:t>
-      </w:r>
-      <w:hyperlink r:id="rId6" w:anchor=":~:text=Eine%20weitere%20Besonderheit%20ist" w:history="1">
-        <w:r>
-          <w:rPr>
-            <w:rStyle w:val="Hyperlink"/>
-            <w:rFonts w:hint="cs"/>
-            <w:rtl/>
-            <w:lang w:bidi="ar-AE"/>
-          </w:rPr>
-          <w:t>وحيرة</w:t>
-        </w:r>
-      </w:hyperlink>
-      <w:bookmarkStart w:id="0" w:name="_GoBack"/>
-      <w:bookmarkEnd w:id="0"/>
-      <w:r>
-        <w:rPr>
-          <w:rFonts w:hint="cs"/>
-          <w:rtl/>
-          <w:lang w:bidi="ar-AE"/>
-        </w:rPr>
-        <w:t>.</w:t>
+        <w:bidi/>
+        <w:jc w:val="both"/>
+        <w:rPr>
+          <w:rFonts w:ascii="Sakkal Majalla" w:hAnsi="Sakkal Majalla" w:cs="Sakkal Majalla"/>
+          <w:sz w:val="28"/>
+          <w:szCs w:val="28"/>
+          <w:rtl/>
+        </w:rPr>
+      </w:pPr>
+      <w:r>
+        <w:rPr>
+          <w:rFonts w:ascii="Sakkal Majalla" w:hAnsi="Sakkal Majalla" w:cs="Sakkal Majalla"/>
+          <w:sz w:val="28"/>
+          <w:szCs w:val="28"/>
+        </w:rPr>
+        <w:t>Der Pharao rief Mose und Aaron eilends und sprach</w:t>
+      </w:r>
+      <w:r>
+        <w:rPr>
+          <w:rFonts w:ascii="Sakkal Majalla" w:hAnsi="Sakkal Majalla" w:cs="Sakkal Majalla"/>
+          <w:sz w:val="28"/>
+          <w:szCs w:val="28"/>
+          <w:rtl/>
+        </w:rPr>
+        <w:t>:</w:t>
       </w:r>
     </w:p>
     <w:sectPr>
       <w:pgSz w:w="11906" w:h="16838"/>
-      <w:pgMar w:top="1440" w:right="1800" w:bottom="1440" w:left="1800" w:header="708" w:footer="708" w:gutter="0"/>
+      <w:pgMar w:top="1440" w:right="1440" w:bottom="1440" w:left="1440" w:header="708" w:footer="708" w:gutter="0"/>
       <w:cols w:space="708"/>
-      <w:bidi/>
-      <w:rtlGutter/>
       <w:docGrid w:linePitch="360"/>
     </w:sectPr>
   </w:body>
@@ -558,17 +417,15 @@
   <w:docDefaults>
     <w:rPrDefault>
       <w:rPr>
-        <w:rFonts w:ascii="Sakkal Majalla" w:eastAsiaTheme="minorHAnsi" w:hAnsi="Sakkal Majalla" w:cs="Sakkal Majalla"/>
-        <w:sz w:val="28"/>
-        <w:szCs w:val="28"/>
-        <w:lang w:val="en-US" w:eastAsia="en-US" w:bidi="ar-SA"/>
+        <w:rFonts w:asciiTheme="minorHAnsi" w:eastAsiaTheme="minorHAnsi" w:hAnsiTheme="minorHAnsi" w:cstheme="minorBidi"/>
+        <w:sz w:val="22"/>
+        <w:szCs w:val="22"/>
+        <w:lang w:eastAsia="en-US" w:bidi="ar-SA"/>
       </w:rPr>
     </w:rPrDefault>
     <w:pPrDefault>
       <w:pPr>
-        <w:bidi/>
         <w:spacing w:after="160" w:line="259" w:lineRule="auto"/>
-        <w:jc w:val="both"/>
       </w:pPr>
     </w:pPrDefault>
   </w:docDefaults>
@@ -954,7 +811,6 @@
     <w:name w:val="Normal"/>
     <w:qFormat/>
     <w:rPr>
-      <w:noProof/>
       <w:lang w:bidi="ar-EG"/>
     </w:rPr>
   </w:style>
@@ -990,7 +846,7 @@
     <w:basedOn w:val="DefaultParagraphFont"/>
     <w:uiPriority w:val="99"/>
     <w:unhideWhenUsed/>
-    <w:rsid w:val="00A835DB"/>
+    <w:rsid w:val="00CA42C1"/>
     <w:rPr>
       <w:color w:val="0563C1" w:themeColor="hyperlink"/>
       <w:u w:val="single"/>
@@ -1002,17 +858,29 @@
     <w:uiPriority w:val="99"/>
     <w:semiHidden/>
     <w:unhideWhenUsed/>
-    <w:rsid w:val="00A835DB"/>
+    <w:rsid w:val="00CA42C1"/>
     <w:rPr>
       <w:color w:val="605E5C"/>
       <w:shd w:val="clear" w:color="auto" w:fill="E1DFDD"/>
+    </w:rPr>
+  </w:style>
+  <w:style w:type="character" w:styleId="FollowedHyperlink">
+    <w:name w:val="FollowedHyperlink"/>
+    <w:basedOn w:val="DefaultParagraphFont"/>
+    <w:uiPriority w:val="99"/>
+    <w:semiHidden/>
+    <w:unhideWhenUsed/>
+    <w:rsid w:val="0073460D"/>
+    <w:rPr>
+      <w:color w:val="954F72" w:themeColor="followedHyperlink"/>
+      <w:u w:val="single"/>
     </w:rPr>
   </w:style>
 </w:styles>
 </file>
 
 <file path=word/theme/theme1.xml><?xml version="1.0" encoding="utf-8"?>
-<a:theme xmlns:a="http://schemas.openxmlformats.org/drawingml/2006/main" name="Office Theme">
+<a:theme xmlns:a="http://schemas.openxmlformats.org/drawingml/2006/main" name="ערכת נושא Office">
   <a:themeElements>
     <a:clrScheme name="Office">
       <a:dk1>

</xml_diff>